<commit_message>
feat: implement case and document generation backend with storage and DOCX rendering support
</commit_message>
<xml_diff>
--- a/templates/person/ly-lich-ca-nhan.docx
+++ b/templates/person/ly-lich-ca-nhan.docx
@@ -464,25 +464,6 @@
                         <w:txbxContent>
                           <w:p>
                             <w:pPr>
-                              <w:jc w:val="center"/>
-                              <w:rPr>
-                                <w:rFonts w:ascii="Times New Roman" w:hAnsi="Times New Roman" w:cs="Times New Roman"/>
-                                <w:i/>
-                              </w:rPr>
-                            </w:pPr>
-                          </w:p>
-                          <w:p>
-                            <w:pPr>
-                              <w:jc w:val="center"/>
-                              <w:rPr>
-                                <w:rFonts w:ascii="Times New Roman" w:hAnsi="Times New Roman" w:cs="Times New Roman"/>
-                                <w:i/>
-                              </w:rPr>
-                            </w:pPr>
-                          </w:p>
-                          <w:p>
-                            <w:pPr>
-                              <w:jc w:val="center"/>
                               <w:rPr>
                                 <w:rFonts w:ascii="Times New Roman" w:hAnsi="Times New Roman" w:cs="Times New Roman"/>
                                 <w:iCs/>
@@ -526,25 +507,6 @@
                   <w:txbxContent>
                     <w:p>
                       <w:pPr>
-                        <w:jc w:val="center"/>
-                        <w:rPr>
-                          <w:rFonts w:ascii="Times New Roman" w:hAnsi="Times New Roman" w:cs="Times New Roman"/>
-                          <w:i/>
-                        </w:rPr>
-                      </w:pPr>
-                    </w:p>
-                    <w:p>
-                      <w:pPr>
-                        <w:jc w:val="center"/>
-                        <w:rPr>
-                          <w:rFonts w:ascii="Times New Roman" w:hAnsi="Times New Roman" w:cs="Times New Roman"/>
-                          <w:i/>
-                        </w:rPr>
-                      </w:pPr>
-                    </w:p>
-                    <w:p>
-                      <w:pPr>
-                        <w:jc w:val="center"/>
                         <w:rPr>
                           <w:rFonts w:ascii="Times New Roman" w:hAnsi="Times New Roman" w:cs="Times New Roman"/>
                           <w:iCs/>
@@ -2175,7 +2137,25 @@
           <w:sz w:val="26"/>
           <w:lang w:val="en-US"/>
         </w:rPr>
-        <w:t>tại }}</w:t>
+        <w:t>t</w:t>
+      </w:r>
+      <w:r>
+        <w:rPr>
+          <w:rFonts w:ascii="Times New Roman" w:eastAsia="Times New Roman" w:hAnsi="Times New Roman" w:cs="Times New Roman"/>
+          <w:spacing w:val="-2"/>
+          <w:sz w:val="26"/>
+          <w:lang w:val="en-US"/>
+        </w:rPr>
+        <w:t>a</w:t>
+      </w:r>
+      <w:r>
+        <w:rPr>
+          <w:rFonts w:ascii="Times New Roman" w:eastAsia="Times New Roman" w:hAnsi="Times New Roman" w:cs="Times New Roman"/>
+          <w:spacing w:val="-2"/>
+          <w:sz w:val="26"/>
+          <w:lang w:val="en-US"/>
+        </w:rPr>
+        <w:t>i }}</w:t>
       </w:r>
     </w:p>
     <w:p>
@@ -2371,78 +2351,6 @@
     <w:p>
       <w:pPr>
         <w:tabs>
-          <w:tab w:val="right" w:pos="0"/>
-          <w:tab w:val="left" w:leader="dot" w:pos="9356"/>
-        </w:tabs>
-        <w:spacing w:line="380" w:lineRule="exact"/>
-        <w:rPr>
-          <w:rFonts w:ascii="Times New Roman" w:eastAsia="Times New Roman" w:hAnsi="Times New Roman" w:cs="Times New Roman"/>
-          <w:color w:val="auto"/>
-          <w:spacing w:val="-2"/>
-          <w:sz w:val="16"/>
-          <w:szCs w:val="20"/>
-        </w:rPr>
-      </w:pPr>
-      <w:r>
-        <w:rPr>
-          <w:rFonts w:ascii="Times New Roman" w:eastAsia="Times New Roman" w:hAnsi="Times New Roman" w:cs="Times New Roman"/>
-          <w:color w:val="auto"/>
-          <w:spacing w:val="-2"/>
-          <w:sz w:val="16"/>
-          <w:szCs w:val="20"/>
-        </w:rPr>
-        <w:tab/>
-      </w:r>
-      <w:r>
-        <w:rPr>
-          <w:rFonts w:ascii="Times New Roman" w:eastAsia="Times New Roman" w:hAnsi="Times New Roman" w:cs="Times New Roman"/>
-          <w:color w:val="auto"/>
-          <w:spacing w:val="-2"/>
-          <w:sz w:val="16"/>
-          <w:szCs w:val="20"/>
-        </w:rPr>
-        <w:tab/>
-      </w:r>
-    </w:p>
-    <w:p>
-      <w:pPr>
-        <w:tabs>
-          <w:tab w:val="right" w:pos="0"/>
-          <w:tab w:val="left" w:leader="dot" w:pos="9356"/>
-        </w:tabs>
-        <w:spacing w:line="380" w:lineRule="exact"/>
-        <w:rPr>
-          <w:rFonts w:ascii="Times New Roman" w:eastAsia="Times New Roman" w:hAnsi="Times New Roman" w:cs="Times New Roman"/>
-          <w:color w:val="auto"/>
-          <w:spacing w:val="-2"/>
-          <w:sz w:val="16"/>
-          <w:szCs w:val="20"/>
-        </w:rPr>
-      </w:pPr>
-      <w:r>
-        <w:rPr>
-          <w:rFonts w:ascii="Times New Roman" w:eastAsia="Times New Roman" w:hAnsi="Times New Roman" w:cs="Times New Roman"/>
-          <w:color w:val="auto"/>
-          <w:spacing w:val="-2"/>
-          <w:sz w:val="16"/>
-          <w:szCs w:val="20"/>
-        </w:rPr>
-        <w:tab/>
-      </w:r>
-      <w:r>
-        <w:rPr>
-          <w:rFonts w:ascii="Times New Roman" w:eastAsia="Times New Roman" w:hAnsi="Times New Roman" w:cs="Times New Roman"/>
-          <w:color w:val="auto"/>
-          <w:spacing w:val="-2"/>
-          <w:sz w:val="16"/>
-          <w:szCs w:val="20"/>
-        </w:rPr>
-        <w:tab/>
-      </w:r>
-    </w:p>
-    <w:p>
-      <w:pPr>
-        <w:tabs>
           <w:tab w:val="right" w:leader="dot" w:pos="0"/>
         </w:tabs>
         <w:spacing w:line="380" w:lineRule="exact"/>
@@ -2568,94 +2476,241 @@
       <w:pPr>
         <w:tabs>
           <w:tab w:val="right" w:pos="0"/>
+          <w:tab w:val="right" w:leader="dot" w:pos="9355"/>
         </w:tabs>
         <w:spacing w:line="380" w:lineRule="exact"/>
-        <w:jc w:val="both"/>
-        <w:rPr>
-          <w:rFonts w:ascii="Times New Roman" w:eastAsia="Times New Roman" w:hAnsi="Times New Roman" w:cs="Times New Roman"/>
-          <w:color w:val="auto"/>
-          <w:spacing w:val="-2"/>
-          <w:sz w:val="26"/>
-          <w:szCs w:val="26"/>
-          <w:lang w:val="en-US"/>
-        </w:rPr>
-      </w:pPr>
-      <w:r>
-        <w:rPr>
-          <w:rFonts w:ascii="Times New Roman" w:eastAsia="Times New Roman" w:hAnsi="Times New Roman" w:cs="Times New Roman"/>
-          <w:color w:val="auto"/>
-          <w:spacing w:val="-2"/>
-          <w:sz w:val="26"/>
-          <w:szCs w:val="26"/>
-          <w:lang w:val="en-US"/>
-        </w:rPr>
-        <w:t>{{ quan</w:t>
-      </w:r>
-      <w:r>
-        <w:rPr>
-          <w:rFonts w:ascii="Times New Roman" w:eastAsia="Times New Roman" w:hAnsi="Times New Roman" w:cs="Times New Roman"/>
-          <w:color w:val="auto"/>
-          <w:spacing w:val="-2"/>
-          <w:sz w:val="26"/>
-          <w:szCs w:val="26"/>
-          <w:lang w:val="en-US"/>
-        </w:rPr>
-        <w:t>_</w:t>
-      </w:r>
-      <w:r>
-        <w:rPr>
-          <w:rFonts w:ascii="Times New Roman" w:eastAsia="Times New Roman" w:hAnsi="Times New Roman" w:cs="Times New Roman"/>
-          <w:color w:val="auto"/>
-          <w:spacing w:val="-2"/>
-          <w:sz w:val="26"/>
-          <w:szCs w:val="26"/>
-          <w:lang w:val="en-US"/>
-        </w:rPr>
-        <w:t>he</w:t>
-      </w:r>
-      <w:r>
-        <w:rPr>
-          <w:rFonts w:ascii="Times New Roman" w:eastAsia="Times New Roman" w:hAnsi="Times New Roman" w:cs="Times New Roman"/>
-          <w:color w:val="auto"/>
-          <w:spacing w:val="-2"/>
-          <w:sz w:val="26"/>
-          <w:szCs w:val="26"/>
-          <w:lang w:val="en-US"/>
-        </w:rPr>
-        <w:t>_</w:t>
-      </w:r>
-      <w:r>
-        <w:rPr>
-          <w:rFonts w:ascii="Times New Roman" w:eastAsia="Times New Roman" w:hAnsi="Times New Roman" w:cs="Times New Roman"/>
-          <w:color w:val="auto"/>
-          <w:spacing w:val="-2"/>
-          <w:sz w:val="26"/>
-          <w:szCs w:val="26"/>
-          <w:lang w:val="en-US"/>
-        </w:rPr>
-        <w:t>gia</w:t>
-      </w:r>
-      <w:r>
-        <w:rPr>
-          <w:rFonts w:ascii="Times New Roman" w:eastAsia="Times New Roman" w:hAnsi="Times New Roman" w:cs="Times New Roman"/>
-          <w:color w:val="auto"/>
-          <w:spacing w:val="-2"/>
-          <w:sz w:val="26"/>
-          <w:szCs w:val="26"/>
-          <w:lang w:val="en-US"/>
-        </w:rPr>
-        <w:t>_</w:t>
-      </w:r>
-      <w:r>
-        <w:rPr>
-          <w:rFonts w:ascii="Times New Roman" w:eastAsia="Times New Roman" w:hAnsi="Times New Roman" w:cs="Times New Roman"/>
-          <w:color w:val="auto"/>
-          <w:spacing w:val="-2"/>
-          <w:sz w:val="26"/>
-          <w:szCs w:val="26"/>
-          <w:lang w:val="en-US"/>
-        </w:rPr>
-        <w:t>dinh }}</w:t>
+        <w:rPr>
+          <w:rFonts w:ascii="Times New Roman" w:eastAsia="Times New Roman" w:hAnsi="Times New Roman" w:cs="Times New Roman"/>
+          <w:color w:val="auto"/>
+          <w:spacing w:val="-2"/>
+          <w:sz w:val="26"/>
+          <w:szCs w:val="26"/>
+          <w:lang w:val="en-US"/>
+        </w:rPr>
+      </w:pPr>
+      <w:r>
+        <w:rPr>
+          <w:rFonts w:ascii="Times New Roman" w:eastAsia="Times New Roman" w:hAnsi="Times New Roman" w:cs="Times New Roman"/>
+          <w:color w:val="auto"/>
+          <w:spacing w:val="-2"/>
+          <w:sz w:val="26"/>
+          <w:szCs w:val="26"/>
+          <w:lang w:val="en-US"/>
+        </w:rPr>
+        <w:t>{%p for item in quan_he_gia_dinh %}</w:t>
+      </w:r>
+    </w:p>
+    <w:p>
+      <w:pPr>
+        <w:tabs>
+          <w:tab w:val="right" w:pos="0"/>
+          <w:tab w:val="left" w:pos="5670"/>
+        </w:tabs>
+        <w:spacing w:line="380" w:lineRule="exact"/>
+        <w:rPr>
+          <w:rFonts w:ascii="Times New Roman" w:eastAsia="Times New Roman" w:hAnsi="Times New Roman" w:cs="Times New Roman"/>
+          <w:color w:val="auto"/>
+          <w:spacing w:val="-2"/>
+          <w:sz w:val="26"/>
+          <w:szCs w:val="26"/>
+          <w:lang w:val="en-US"/>
+        </w:rPr>
+      </w:pPr>
+      <w:r>
+        <w:rPr>
+          <w:rFonts w:ascii="Times New Roman" w:eastAsia="Times New Roman" w:hAnsi="Times New Roman" w:cs="Times New Roman"/>
+          <w:color w:val="auto"/>
+          <w:spacing w:val="-2"/>
+          <w:sz w:val="26"/>
+          <w:szCs w:val="26"/>
+          <w:lang w:val="en-US"/>
+        </w:rPr>
+        <w:t xml:space="preserve">{{ loop.index }}. </w:t>
+      </w:r>
+      <w:r>
+        <w:rPr>
+          <w:rFonts w:ascii="Times New Roman" w:eastAsia="Times New Roman" w:hAnsi="Times New Roman" w:cs="Times New Roman"/>
+          <w:b/>
+          <w:bCs/>
+          <w:color w:val="auto"/>
+          <w:spacing w:val="-2"/>
+          <w:sz w:val="26"/>
+          <w:szCs w:val="26"/>
+          <w:lang w:val="en-US"/>
+        </w:rPr>
+        <w:t>{{ item.quan_he }}:</w:t>
+      </w:r>
+      <w:r>
+        <w:rPr>
+          <w:rFonts w:ascii="Times New Roman" w:eastAsia="Times New Roman" w:hAnsi="Times New Roman" w:cs="Times New Roman"/>
+          <w:color w:val="auto"/>
+          <w:spacing w:val="-2"/>
+          <w:sz w:val="26"/>
+          <w:szCs w:val="26"/>
+          <w:lang w:val="en-US"/>
+        </w:rPr>
+        <w:t xml:space="preserve"> {{ item.ho_ten }} </w:t>
+      </w:r>
+      <w:r>
+        <w:rPr>
+          <w:rFonts w:ascii="Times New Roman" w:eastAsia="Times New Roman" w:hAnsi="Times New Roman" w:cs="Times New Roman"/>
+          <w:color w:val="auto"/>
+          <w:spacing w:val="-2"/>
+          <w:sz w:val="26"/>
+          <w:szCs w:val="26"/>
+          <w:lang w:val="en-US"/>
+        </w:rPr>
+        <w:tab/>
+      </w:r>
+      <w:r>
+        <w:rPr>
+          <w:rFonts w:ascii="Times New Roman" w:eastAsia="Times New Roman" w:hAnsi="Times New Roman" w:cs="Times New Roman"/>
+          <w:color w:val="auto"/>
+          <w:spacing w:val="-2"/>
+          <w:sz w:val="26"/>
+          <w:szCs w:val="26"/>
+          <w:lang w:val="en-US"/>
+        </w:rPr>
+        <w:t>(</w:t>
+      </w:r>
+      <w:r>
+        <w:rPr>
+          <w:rFonts w:ascii="Times New Roman" w:eastAsia="Times New Roman" w:hAnsi="Times New Roman" w:cs="Times New Roman"/>
+          <w:color w:val="auto"/>
+          <w:spacing w:val="-2"/>
+          <w:sz w:val="26"/>
+          <w:szCs w:val="26"/>
+          <w:lang w:val="en-US"/>
+        </w:rPr>
+        <w:t>sinh năm</w:t>
+      </w:r>
+      <w:r>
+        <w:rPr>
+          <w:rFonts w:ascii="Times New Roman" w:eastAsia="Times New Roman" w:hAnsi="Times New Roman" w:cs="Times New Roman"/>
+          <w:color w:val="auto"/>
+          <w:spacing w:val="-2"/>
+          <w:sz w:val="26"/>
+          <w:szCs w:val="26"/>
+          <w:lang w:val="en-US"/>
+        </w:rPr>
+        <w:t>: {{ item.nam_sinh }})</w:t>
+      </w:r>
+    </w:p>
+    <w:p>
+      <w:pPr>
+        <w:tabs>
+          <w:tab w:val="right" w:pos="0"/>
+          <w:tab w:val="right" w:leader="dot" w:pos="9355"/>
+        </w:tabs>
+        <w:spacing w:line="380" w:lineRule="exact"/>
+        <w:rPr>
+          <w:rFonts w:ascii="Times New Roman" w:eastAsia="Times New Roman" w:hAnsi="Times New Roman" w:cs="Times New Roman"/>
+          <w:color w:val="auto"/>
+          <w:spacing w:val="-2"/>
+          <w:sz w:val="26"/>
+          <w:szCs w:val="26"/>
+          <w:lang w:val="en-US"/>
+        </w:rPr>
+      </w:pPr>
+      <w:r>
+        <w:rPr>
+          <w:rFonts w:ascii="Times New Roman" w:eastAsia="Times New Roman" w:hAnsi="Times New Roman" w:cs="Times New Roman"/>
+          <w:color w:val="auto"/>
+          <w:spacing w:val="-2"/>
+          <w:sz w:val="26"/>
+          <w:szCs w:val="26"/>
+          <w:lang w:val="en-US"/>
+        </w:rPr>
+        <w:t>Nghề nghiệp</w:t>
+      </w:r>
+      <w:r>
+        <w:rPr>
+          <w:rFonts w:ascii="Times New Roman" w:eastAsia="Times New Roman" w:hAnsi="Times New Roman" w:cs="Times New Roman"/>
+          <w:color w:val="auto"/>
+          <w:spacing w:val="-2"/>
+          <w:sz w:val="26"/>
+          <w:szCs w:val="26"/>
+          <w:lang w:val="en-US"/>
+        </w:rPr>
+        <w:t>:</w:t>
+      </w:r>
+      <w:r>
+        <w:rPr>
+          <w:rFonts w:ascii="Times New Roman" w:eastAsia="Times New Roman" w:hAnsi="Times New Roman" w:cs="Times New Roman"/>
+          <w:color w:val="auto"/>
+          <w:spacing w:val="-2"/>
+          <w:sz w:val="26"/>
+          <w:szCs w:val="26"/>
+          <w:lang w:val="en-US"/>
+        </w:rPr>
+        <w:t xml:space="preserve"> </w:t>
+      </w:r>
+      <w:r>
+        <w:rPr>
+          <w:rFonts w:ascii="Times New Roman" w:eastAsia="Times New Roman" w:hAnsi="Times New Roman" w:cs="Times New Roman"/>
+          <w:color w:val="auto"/>
+          <w:spacing w:val="-2"/>
+          <w:sz w:val="26"/>
+          <w:szCs w:val="26"/>
+          <w:lang w:val="en-US"/>
+        </w:rPr>
+        <w:t>{{ item.nghe_nghiep }}</w:t>
+      </w:r>
+    </w:p>
+    <w:p>
+      <w:pPr>
+        <w:tabs>
+          <w:tab w:val="right" w:pos="0"/>
+          <w:tab w:val="right" w:leader="dot" w:pos="9355"/>
+        </w:tabs>
+        <w:spacing w:line="380" w:lineRule="exact"/>
+        <w:rPr>
+          <w:rFonts w:ascii="Times New Roman" w:eastAsia="Times New Roman" w:hAnsi="Times New Roman" w:cs="Times New Roman"/>
+          <w:color w:val="auto"/>
+          <w:spacing w:val="-2"/>
+          <w:sz w:val="26"/>
+          <w:szCs w:val="26"/>
+          <w:lang w:val="en-US"/>
+        </w:rPr>
+      </w:pPr>
+      <w:r>
+        <w:rPr>
+          <w:rFonts w:ascii="Times New Roman" w:eastAsia="Times New Roman" w:hAnsi="Times New Roman" w:cs="Times New Roman"/>
+          <w:color w:val="auto"/>
+          <w:spacing w:val="-2"/>
+          <w:sz w:val="26"/>
+          <w:szCs w:val="26"/>
+          <w:lang w:val="en-US"/>
+        </w:rPr>
+        <w:t>Nơi ở hiện nay: {{ item.noi_o }}</w:t>
+      </w:r>
+    </w:p>
+    <w:p>
+      <w:pPr>
+        <w:tabs>
+          <w:tab w:val="right" w:pos="0"/>
+          <w:tab w:val="right" w:leader="dot" w:pos="9355"/>
+        </w:tabs>
+        <w:spacing w:line="380" w:lineRule="exact"/>
+        <w:rPr>
+          <w:rFonts w:ascii="Times New Roman" w:eastAsia="Times New Roman" w:hAnsi="Times New Roman" w:cs="Times New Roman"/>
+          <w:color w:val="auto"/>
+          <w:spacing w:val="-2"/>
+          <w:sz w:val="26"/>
+          <w:szCs w:val="26"/>
+          <w:lang w:val="en-US"/>
+        </w:rPr>
+      </w:pPr>
+      <w:r>
+        <w:rPr>
+          <w:rFonts w:ascii="Times New Roman" w:eastAsia="Times New Roman" w:hAnsi="Times New Roman" w:cs="Times New Roman"/>
+          <w:color w:val="auto"/>
+          <w:spacing w:val="-2"/>
+          <w:sz w:val="26"/>
+          <w:szCs w:val="26"/>
+          <w:lang w:val="en-US"/>
+        </w:rPr>
+        <w:t>{%p endfor %}</w:t>
       </w:r>
     </w:p>
     <w:p>
@@ -2782,6 +2837,7 @@
           <w:spacing w:val="-2"/>
           <w:sz w:val="16"/>
         </w:rPr>
+        <w:lastRenderedPageBreak/>
         <w:tab/>
       </w:r>
     </w:p>
@@ -3944,6 +4000,163 @@
     </w:sectPr>
   </w:body>
 </w:document>
+</file>
+
+<file path=word/numbering.xml><?xml version="1.0" encoding="utf-8"?>
+<w:numbering xmlns:wpc="http://schemas.microsoft.com/office/word/2010/wordprocessingCanvas" xmlns:cx="http://schemas.microsoft.com/office/drawing/2014/chartex" xmlns:cx1="http://schemas.microsoft.com/office/drawing/2015/9/8/chartex" xmlns:cx2="http://schemas.microsoft.com/office/drawing/2015/10/21/chartex" xmlns:cx3="http://schemas.microsoft.com/office/drawing/2016/5/9/chartex" xmlns:cx4="http://schemas.microsoft.com/office/drawing/2016/5/10/chartex" xmlns:cx5="http://schemas.microsoft.com/office/drawing/2016/5/11/chartex" xmlns:cx6="http://schemas.microsoft.com/office/drawing/2016/5/12/chartex" xmlns:cx7="http://schemas.microsoft.com/office/drawing/2016/5/13/chartex" xmlns:cx8="http://schemas.microsoft.com/office/drawing/2016/5/14/chartex" xmlns:mc="http://schemas.openxmlformats.org/markup-compatibility/2006" xmlns:aink="http://schemas.microsoft.com/office/drawing/2016/ink" xmlns:am3d="http://schemas.microsoft.com/office/drawing/2017/model3d" xmlns:o="urn:schemas-microsoft-com:office:office" xmlns:oel="http://schemas.microsoft.com/office/2019/extlst" xmlns:r="http://schemas.openxmlformats.org/officeDocument/2006/relationships" xmlns:m="http://schemas.openxmlformats.org/officeDocument/2006/math" xmlns:v="urn:schemas-microsoft-com:vml" xmlns:wp14="http://schemas.microsoft.com/office/word/2010/wordprocessingDrawing" xmlns:wp="http://schemas.openxmlformats.org/drawingml/2006/wordprocessingDrawing" xmlns:w10="urn:schemas-microsoft-com:office:word" xmlns:w="http://schemas.openxmlformats.org/wordprocessingml/2006/main" xmlns:w14="http://schemas.microsoft.com/office/word/2010/wordml" xmlns:w15="http://schemas.microsoft.com/office/word/2012/wordml" xmlns:w16cei="http://schemas.microsoft.com/office/word/2026/wordml/cei" xmlns:w16cex="http://schemas.microsoft.com/office/word/2018/wordml/cex" xmlns:w16cid="http://schemas.microsoft.com/office/word/2016/wordml/cid" xmlns:w16="http://schemas.microsoft.com/office/word/2018/wordml" xmlns:w16du="http://schemas.microsoft.com/office/word/2023/wordml/word16du" xmlns:w16sdtdh="http://schemas.microsoft.com/office/word/2020/wordml/sdtdatahash" xmlns:w16sdtfl="http://schemas.microsoft.com/office/word/2024/wordml/sdtformatlock" xmlns:w16se="http://schemas.microsoft.com/office/word/2015/wordml/symex" xmlns:wpg="http://schemas.microsoft.com/office/word/2010/wordprocessingGroup" xmlns:wpi="http://schemas.microsoft.com/office/word/2010/wordprocessingInk" xmlns:wne="http://schemas.microsoft.com/office/word/2006/wordml" xmlns:wps="http://schemas.microsoft.com/office/word/2010/wordprocessingShape" mc:Ignorable="w14 w15 w16se w16cid w16 w16cex w16sdtdh w16sdtfl w16du wp14">
+  <w:abstractNum w:abstractNumId="0" w15:restartNumberingAfterBreak="0">
+    <w:nsid w:val="27E41E1A"/>
+    <w:multiLevelType w:val="multilevel"/>
+    <w:tmpl w:val="1360C774"/>
+    <w:lvl w:ilvl="0">
+      <w:start w:val="1"/>
+      <w:numFmt w:val="bullet"/>
+      <w:lvlText w:val=""/>
+      <w:lvlJc w:val="left"/>
+      <w:pPr>
+        <w:tabs>
+          <w:tab w:val="num" w:pos="720"/>
+        </w:tabs>
+        <w:ind w:left="720" w:hanging="360"/>
+      </w:pPr>
+      <w:rPr>
+        <w:rFonts w:ascii="Symbol" w:hAnsi="Symbol" w:hint="default"/>
+        <w:sz w:val="20"/>
+      </w:rPr>
+    </w:lvl>
+    <w:lvl w:ilvl="1" w:tentative="1">
+      <w:start w:val="1"/>
+      <w:numFmt w:val="bullet"/>
+      <w:lvlText w:val=""/>
+      <w:lvlJc w:val="left"/>
+      <w:pPr>
+        <w:tabs>
+          <w:tab w:val="num" w:pos="1440"/>
+        </w:tabs>
+        <w:ind w:left="1440" w:hanging="360"/>
+      </w:pPr>
+      <w:rPr>
+        <w:rFonts w:ascii="Symbol" w:hAnsi="Symbol" w:hint="default"/>
+        <w:sz w:val="20"/>
+      </w:rPr>
+    </w:lvl>
+    <w:lvl w:ilvl="2" w:tentative="1">
+      <w:start w:val="1"/>
+      <w:numFmt w:val="bullet"/>
+      <w:lvlText w:val=""/>
+      <w:lvlJc w:val="left"/>
+      <w:pPr>
+        <w:tabs>
+          <w:tab w:val="num" w:pos="2160"/>
+        </w:tabs>
+        <w:ind w:left="2160" w:hanging="360"/>
+      </w:pPr>
+      <w:rPr>
+        <w:rFonts w:ascii="Symbol" w:hAnsi="Symbol" w:hint="default"/>
+        <w:sz w:val="20"/>
+      </w:rPr>
+    </w:lvl>
+    <w:lvl w:ilvl="3" w:tentative="1">
+      <w:start w:val="1"/>
+      <w:numFmt w:val="bullet"/>
+      <w:lvlText w:val=""/>
+      <w:lvlJc w:val="left"/>
+      <w:pPr>
+        <w:tabs>
+          <w:tab w:val="num" w:pos="2880"/>
+        </w:tabs>
+        <w:ind w:left="2880" w:hanging="360"/>
+      </w:pPr>
+      <w:rPr>
+        <w:rFonts w:ascii="Symbol" w:hAnsi="Symbol" w:hint="default"/>
+        <w:sz w:val="20"/>
+      </w:rPr>
+    </w:lvl>
+    <w:lvl w:ilvl="4" w:tentative="1">
+      <w:start w:val="1"/>
+      <w:numFmt w:val="bullet"/>
+      <w:lvlText w:val=""/>
+      <w:lvlJc w:val="left"/>
+      <w:pPr>
+        <w:tabs>
+          <w:tab w:val="num" w:pos="3600"/>
+        </w:tabs>
+        <w:ind w:left="3600" w:hanging="360"/>
+      </w:pPr>
+      <w:rPr>
+        <w:rFonts w:ascii="Symbol" w:hAnsi="Symbol" w:hint="default"/>
+        <w:sz w:val="20"/>
+      </w:rPr>
+    </w:lvl>
+    <w:lvl w:ilvl="5" w:tentative="1">
+      <w:start w:val="1"/>
+      <w:numFmt w:val="bullet"/>
+      <w:lvlText w:val=""/>
+      <w:lvlJc w:val="left"/>
+      <w:pPr>
+        <w:tabs>
+          <w:tab w:val="num" w:pos="4320"/>
+        </w:tabs>
+        <w:ind w:left="4320" w:hanging="360"/>
+      </w:pPr>
+      <w:rPr>
+        <w:rFonts w:ascii="Symbol" w:hAnsi="Symbol" w:hint="default"/>
+        <w:sz w:val="20"/>
+      </w:rPr>
+    </w:lvl>
+    <w:lvl w:ilvl="6" w:tentative="1">
+      <w:start w:val="1"/>
+      <w:numFmt w:val="bullet"/>
+      <w:lvlText w:val=""/>
+      <w:lvlJc w:val="left"/>
+      <w:pPr>
+        <w:tabs>
+          <w:tab w:val="num" w:pos="5040"/>
+        </w:tabs>
+        <w:ind w:left="5040" w:hanging="360"/>
+      </w:pPr>
+      <w:rPr>
+        <w:rFonts w:ascii="Symbol" w:hAnsi="Symbol" w:hint="default"/>
+        <w:sz w:val="20"/>
+      </w:rPr>
+    </w:lvl>
+    <w:lvl w:ilvl="7" w:tentative="1">
+      <w:start w:val="1"/>
+      <w:numFmt w:val="bullet"/>
+      <w:lvlText w:val=""/>
+      <w:lvlJc w:val="left"/>
+      <w:pPr>
+        <w:tabs>
+          <w:tab w:val="num" w:pos="5760"/>
+        </w:tabs>
+        <w:ind w:left="5760" w:hanging="360"/>
+      </w:pPr>
+      <w:rPr>
+        <w:rFonts w:ascii="Symbol" w:hAnsi="Symbol" w:hint="default"/>
+        <w:sz w:val="20"/>
+      </w:rPr>
+    </w:lvl>
+    <w:lvl w:ilvl="8" w:tentative="1">
+      <w:start w:val="1"/>
+      <w:numFmt w:val="bullet"/>
+      <w:lvlText w:val=""/>
+      <w:lvlJc w:val="left"/>
+      <w:pPr>
+        <w:tabs>
+          <w:tab w:val="num" w:pos="6480"/>
+        </w:tabs>
+        <w:ind w:left="6480" w:hanging="360"/>
+      </w:pPr>
+      <w:rPr>
+        <w:rFonts w:ascii="Symbol" w:hAnsi="Symbol" w:hint="default"/>
+        <w:sz w:val="20"/>
+      </w:rPr>
+    </w:lvl>
+  </w:abstractNum>
+  <w:num w:numId="1" w16cid:durableId="330330933">
+    <w:abstractNumId w:val="0"/>
+  </w:num>
+</w:numbering>
 </file>
 
 <file path=word/styles.xml><?xml version="1.0" encoding="utf-8"?>

</xml_diff>